<commit_message>
PEPI: agregar Excel con calculos (formulas vivas) y arboles como esquema visual
</commit_message>
<xml_diff>
--- a/Proyectos/PEPI/Solucion/INFORME_PEPI.docx
+++ b/Proyectos/PEPI/Solucion/INFORME_PEPI.docx
@@ -449,187 +449,46 @@
           <w:i w:val="0"/>
           <w:sz w:val="22"/>
         </w:rPr>
-        <w:t>Problema central: Deficiente prestación del servicio de acueducto en el municipio de El Progreso.</w:t>
+        <w:t>Problema central: Deficiente prestación del servicio de acueducto en el municipio de El Progreso. Los efectos (consecuencias) se ubican en la parte superior y las causas en la parte inferior.</w:t>
       </w:r>
     </w:p>
     <w:p>
       <w:pPr>
-        <w:pStyle w:val="Heading2"/>
+        <w:jc w:val="center"/>
       </w:pPr>
       <w:r>
-        <w:rPr>
-          <w:color w:val="1F4E79"/>
-          <w:sz w:val="24"/>
-        </w:rPr>
-        <w:t>Efecto final</w:t>
-      </w:r>
-    </w:p>
-    <w:p>
-      <w:pPr>
-        <w:jc w:val="both"/>
-      </w:pPr>
-      <w:r>
-        <w:rPr>
-          <w:i w:val="0"/>
-          <w:sz w:val="22"/>
-        </w:rPr>
-        <w:t>Bajo desarrollo social y económico del municipio.</w:t>
-      </w:r>
-    </w:p>
-    <w:p>
-      <w:pPr>
-        <w:pStyle w:val="Heading2"/>
-      </w:pPr>
-      <w:r>
-        <w:rPr>
-          <w:color w:val="1F4E79"/>
-          <w:sz w:val="24"/>
-        </w:rPr>
-        <w:t>Consecuencias (efectos)</w:t>
-      </w:r>
-    </w:p>
-    <w:p>
-      <w:pPr>
-        <w:pStyle w:val="ListBullet"/>
-      </w:pPr>
-      <w:r>
-        <w:t>Aumento de enfermedades de origen hídrico (EDA).</w:t>
-      </w:r>
-    </w:p>
-    <w:p>
-      <w:pPr>
-        <w:pStyle w:val="ListBullet"/>
-      </w:pPr>
-      <w:r>
-        <w:t>Sobrecostos por compra de agua en carrotanques.</w:t>
-      </w:r>
-    </w:p>
-    <w:p>
-      <w:pPr>
-        <w:pStyle w:val="ListBullet"/>
-      </w:pPr>
-      <w:r>
-        <w:t>Baja calidad de vida y deterioro económico local.</w:t>
-      </w:r>
-    </w:p>
-    <w:p>
-      <w:pPr>
-        <w:pStyle w:val="ListBullet"/>
-      </w:pPr>
-      <w:r>
-        <w:t>Pérdida de credibilidad institucional del prestador.</w:t>
-      </w:r>
-    </w:p>
-    <w:p>
-      <w:pPr>
-        <w:pStyle w:val="Heading2"/>
-      </w:pPr>
-      <w:r>
-        <w:rPr>
-          <w:color w:val="1F4E79"/>
-          <w:sz w:val="24"/>
-        </w:rPr>
-        <w:t>Problema central</w:t>
-      </w:r>
-    </w:p>
-    <w:p>
-      <w:pPr>
-        <w:jc w:val="both"/>
-      </w:pPr>
-      <w:r>
-        <w:rPr>
-          <w:i w:val="0"/>
-          <w:sz w:val="22"/>
-        </w:rPr>
-        <w:t>Deficiente prestación del servicio de acueducto en el municipio de El Progreso.</w:t>
-      </w:r>
-    </w:p>
-    <w:p>
-      <w:pPr>
-        <w:pStyle w:val="Heading2"/>
-      </w:pPr>
-      <w:r>
-        <w:rPr>
-          <w:color w:val="1F4E79"/>
-          <w:sz w:val="24"/>
-        </w:rPr>
-        <w:t>Causas</w:t>
-      </w:r>
-    </w:p>
-    <w:p>
-      <w:pPr>
-        <w:pStyle w:val="ListBullet"/>
-      </w:pPr>
-      <w:r>
-        <w:rPr>
-          <w:b/>
-        </w:rPr>
-        <w:t>PTAP obsoleta y sobrecargada</w:t>
-      </w:r>
-    </w:p>
-    <w:p>
-      <w:pPr>
-        <w:pStyle w:val="ListBullet2"/>
-      </w:pPr>
-      <w:r>
-        <w:t>Causa raíz: Equipos al final de su vida útil.</w:t>
-      </w:r>
-    </w:p>
-    <w:p>
-      <w:pPr>
-        <w:pStyle w:val="ListBullet"/>
-      </w:pPr>
-      <w:r>
-        <w:rPr>
-          <w:b/>
-        </w:rPr>
-        <w:t>Altas pérdidas técnicas y comerciales (IANC 48 %)</w:t>
-      </w:r>
-    </w:p>
-    <w:p>
-      <w:pPr>
-        <w:pStyle w:val="ListBullet2"/>
-      </w:pPr>
-      <w:r>
-        <w:t>Causa raíz: Conexiones fraudulentas y fugas no detectadas.</w:t>
-      </w:r>
-    </w:p>
-    <w:p>
-      <w:pPr>
-        <w:pStyle w:val="ListBullet"/>
-      </w:pPr>
-      <w:r>
-        <w:rPr>
-          <w:b/>
-        </w:rPr>
-        <w:t>Redes antiguas y sin sectorización</w:t>
-      </w:r>
-    </w:p>
-    <w:p>
-      <w:pPr>
-        <w:pStyle w:val="ListBullet2"/>
-      </w:pPr>
-      <w:r>
-        <w:t>Causa raíz: Falta de inversión histórica en infraestructura.</w:t>
-      </w:r>
-    </w:p>
-    <w:p>
-      <w:pPr>
-        <w:pStyle w:val="ListBullet"/>
-      </w:pPr>
-      <w:r>
-        <w:rPr>
-          <w:b/>
-        </w:rPr>
-        <w:t>Baja micromedición y cartera morosa</w:t>
-      </w:r>
-    </w:p>
-    <w:p>
-      <w:pPr>
-        <w:pStyle w:val="ListBullet2"/>
-      </w:pPr>
-      <w:r>
-        <w:t>Causa raíz: Débil gestión comercial del prestador.</w:t>
+        <w:drawing>
+          <wp:inline xmlns:a="http://schemas.openxmlformats.org/drawingml/2006/main" xmlns:pic="http://schemas.openxmlformats.org/drawingml/2006/picture">
+            <wp:extent cx="5760720" cy="3825015"/>
+            <wp:docPr id="1" name="Picture 1"/>
+            <wp:cNvGraphicFramePr>
+              <a:graphicFrameLocks noChangeAspect="1"/>
+            </wp:cNvGraphicFramePr>
+            <a:graphic>
+              <a:graphicData uri="http://schemas.openxmlformats.org/drawingml/2006/picture">
+                <pic:pic>
+                  <pic:nvPicPr>
+                    <pic:cNvPr id="0" name="arbol_problemas.png"/>
+                    <pic:cNvPicPr/>
+                  </pic:nvPicPr>
+                  <pic:blipFill>
+                    <a:blip r:embed="rId9"/>
+                    <a:stretch>
+                      <a:fillRect/>
+                    </a:stretch>
+                  </pic:blipFill>
+                  <pic:spPr>
+                    <a:xfrm>
+                      <a:off x="0" y="0"/>
+                      <a:ext cx="5760720" cy="3825015"/>
+                    </a:xfrm>
+                    <a:prstGeom prst="rect"/>
+                  </pic:spPr>
+                </pic:pic>
+              </a:graphicData>
+            </a:graphic>
+          </wp:inline>
+        </w:drawing>
       </w:r>
     </w:p>
     <w:p>
@@ -653,187 +512,46 @@
           <w:i w:val="0"/>
           <w:sz w:val="22"/>
         </w:rPr>
-        <w:t>Objetivo central: Mejorar la prestación del servicio de acueducto en el municipio de El Progreso.</w:t>
+        <w:t>Objetivo central: Mejorar la prestación del servicio de acueducto en el municipio de El Progreso. Es el espejo en positivo del árbol de problemas: cada causa se convierte en un medio y cada efecto en un fin.</w:t>
       </w:r>
     </w:p>
     <w:p>
       <w:pPr>
-        <w:pStyle w:val="Heading2"/>
+        <w:jc w:val="center"/>
       </w:pPr>
       <w:r>
-        <w:rPr>
-          <w:color w:val="1F4E79"/>
-          <w:sz w:val="24"/>
-        </w:rPr>
-        <w:t>Fin último</w:t>
-      </w:r>
-    </w:p>
-    <w:p>
-      <w:pPr>
-        <w:jc w:val="both"/>
-      </w:pPr>
-      <w:r>
-        <w:rPr>
-          <w:i w:val="0"/>
-          <w:sz w:val="22"/>
-        </w:rPr>
-        <w:t>Mayor desarrollo social y económico del municipio.</w:t>
-      </w:r>
-    </w:p>
-    <w:p>
-      <w:pPr>
-        <w:pStyle w:val="Heading2"/>
-      </w:pPr>
-      <w:r>
-        <w:rPr>
-          <w:color w:val="1F4E79"/>
-          <w:sz w:val="24"/>
-        </w:rPr>
-        <w:t>Fines</w:t>
-      </w:r>
-    </w:p>
-    <w:p>
-      <w:pPr>
-        <w:pStyle w:val="ListBullet"/>
-      </w:pPr>
-      <w:r>
-        <w:t>Reducción de enfermedades de origen hídrico.</w:t>
-      </w:r>
-    </w:p>
-    <w:p>
-      <w:pPr>
-        <w:pStyle w:val="ListBullet"/>
-      </w:pPr>
-      <w:r>
-        <w:t>Eliminación del gasto en carrotanques.</w:t>
-      </w:r>
-    </w:p>
-    <w:p>
-      <w:pPr>
-        <w:pStyle w:val="ListBullet"/>
-      </w:pPr>
-      <w:r>
-        <w:t>Mejora de la calidad de vida y reactivación económica.</w:t>
-      </w:r>
-    </w:p>
-    <w:p>
-      <w:pPr>
-        <w:pStyle w:val="ListBullet"/>
-      </w:pPr>
-      <w:r>
-        <w:t>Fortalecimiento institucional del prestador.</w:t>
-      </w:r>
-    </w:p>
-    <w:p>
-      <w:pPr>
-        <w:pStyle w:val="Heading2"/>
-      </w:pPr>
-      <w:r>
-        <w:rPr>
-          <w:color w:val="1F4E79"/>
-          <w:sz w:val="24"/>
-        </w:rPr>
-        <w:t>Objetivo central</w:t>
-      </w:r>
-    </w:p>
-    <w:p>
-      <w:pPr>
-        <w:jc w:val="both"/>
-      </w:pPr>
-      <w:r>
-        <w:rPr>
-          <w:i w:val="0"/>
-          <w:sz w:val="22"/>
-        </w:rPr>
-        <w:t>Mejorar la prestación del servicio de acueducto en el municipio de El Progreso.</w:t>
-      </w:r>
-    </w:p>
-    <w:p>
-      <w:pPr>
-        <w:pStyle w:val="Heading2"/>
-      </w:pPr>
-      <w:r>
-        <w:rPr>
-          <w:color w:val="1F4E79"/>
-          <w:sz w:val="24"/>
-        </w:rPr>
-        <w:t>Medios</w:t>
-      </w:r>
-    </w:p>
-    <w:p>
-      <w:pPr>
-        <w:pStyle w:val="ListBullet"/>
-      </w:pPr>
-      <w:r>
-        <w:rPr>
-          <w:b/>
-        </w:rPr>
-        <w:t>Construir una nueva PTAP de 120 L/s</w:t>
-      </w:r>
-    </w:p>
-    <w:p>
-      <w:pPr>
-        <w:pStyle w:val="ListBullet2"/>
-      </w:pPr>
-      <w:r>
-        <w:t>Medio fundamental: Equipos modernos y eficientes.</w:t>
-      </w:r>
-    </w:p>
-    <w:p>
-      <w:pPr>
-        <w:pStyle w:val="ListBullet"/>
-      </w:pPr>
-      <w:r>
-        <w:rPr>
-          <w:b/>
-        </w:rPr>
-        <w:t>Reducir el IANC del 48 % al 25 %</w:t>
-      </w:r>
-    </w:p>
-    <w:p>
-      <w:pPr>
-        <w:pStyle w:val="ListBullet2"/>
-      </w:pPr>
-      <w:r>
-        <w:t>Medio fundamental: Programa de detección de fugas y control de fraude.</w:t>
-      </w:r>
-    </w:p>
-    <w:p>
-      <w:pPr>
-        <w:pStyle w:val="ListBullet"/>
-      </w:pPr>
-      <w:r>
-        <w:rPr>
-          <w:b/>
-        </w:rPr>
-        <w:t>Rehabilitar y sectorizar las redes</w:t>
-      </w:r>
-    </w:p>
-    <w:p>
-      <w:pPr>
-        <w:pStyle w:val="ListBullet2"/>
-      </w:pPr>
-      <w:r>
-        <w:t>Medio fundamental: Plan de inversiones plurianual financiado.</w:t>
-      </w:r>
-    </w:p>
-    <w:p>
-      <w:pPr>
-        <w:pStyle w:val="ListBullet"/>
-      </w:pPr>
-      <w:r>
-        <w:rPr>
-          <w:b/>
-        </w:rPr>
-        <w:t>Instalar micromedición y mejorar el recaudo</w:t>
-      </w:r>
-    </w:p>
-    <w:p>
-      <w:pPr>
-        <w:pStyle w:val="ListBullet2"/>
-      </w:pPr>
-      <w:r>
-        <w:t>Medio fundamental: Gestión comercial fortalecida.</w:t>
+        <w:drawing>
+          <wp:inline xmlns:a="http://schemas.openxmlformats.org/drawingml/2006/main" xmlns:pic="http://schemas.openxmlformats.org/drawingml/2006/picture">
+            <wp:extent cx="5760720" cy="3825015"/>
+            <wp:docPr id="2" name="Picture 2"/>
+            <wp:cNvGraphicFramePr>
+              <a:graphicFrameLocks noChangeAspect="1"/>
+            </wp:cNvGraphicFramePr>
+            <a:graphic>
+              <a:graphicData uri="http://schemas.openxmlformats.org/drawingml/2006/picture">
+                <pic:pic>
+                  <pic:nvPicPr>
+                    <pic:cNvPr id="0" name="arbol_objetivos.png"/>
+                    <pic:cNvPicPr/>
+                  </pic:nvPicPr>
+                  <pic:blipFill>
+                    <a:blip r:embed="rId10"/>
+                    <a:stretch>
+                      <a:fillRect/>
+                    </a:stretch>
+                  </pic:blipFill>
+                  <pic:spPr>
+                    <a:xfrm>
+                      <a:off x="0" y="0"/>
+                      <a:ext cx="5760720" cy="3825015"/>
+                    </a:xfrm>
+                    <a:prstGeom prst="rect"/>
+                  </pic:spPr>
+                </pic:pic>
+              </a:graphicData>
+            </a:graphic>
+          </wp:inline>
+        </w:drawing>
       </w:r>
     </w:p>
     <w:p>

</xml_diff>